<commit_message>
Add docs/PRD_REVISION_LOG.md and log effort through 2026-09-17
Resolves the two existing references to this file (docs/PRD.md,
README.md) with a markdown rendering of the already-completed Stage 5
workbook, plus a dated addendum recording the 2026-09-17 clean
validation-set rerun: confirms FCR/escalation meet target at
validation-set scale, corrects the NFR-01 latency root-cause claim,
and surfaces a new tier-fairness question the 500-ticket run had
appeared to settle.

Effort log: four new 2026-09-17 entries (report update, submission
audit, this file, and the clean-run report revision), total 8.0h.
</commit_message>
<xml_diff>
--- a/docs/workbooks/Effort_Log.docx
+++ b/docs/workbooks/Effort_Log.docx
@@ -1006,7 +1006,7 @@
           </w:tcPr>
           <w:p>
             <w:r>
-              <w:t>3.8</w:t>
+              <w:t>4.4</w:t>
             </w:r>
           </w:p>
         </w:tc>
@@ -1038,7 +1038,7 @@
           </w:tcPr>
           <w:p>
             <w:r>
-              <w:t>See note in Planned hours. This stage covers the core pipeline build, governance doc, both dependency fixes, the Groq model deprecation fix, both evaluation runs, the decision log bug fix, and the PRD revision log.</w:t>
+              <w:t>See note in Planned hours. This stage covers the core pipeline build, governance doc, both dependency fixes, the Groq model deprecation fix, both evaluation runs, the decision log bug fix, the PRD revision log workbook, the submission-checklist audit, and creating docs/PRD_REVISION_LOG.md.</w:t>
             </w:r>
           </w:p>
         </w:tc>
@@ -1091,7 +1091,7 @@
           </w:tcPr>
           <w:p>
             <w:r>
-              <w:t>0</w:t>
+              <w:t>2.3</w:t>
             </w:r>
           </w:p>
         </w:tc>
@@ -1125,7 +1125,7 @@
           </w:tcPr>
           <w:p>
             <w:r>
-              <w:t>Not started yet.</w:t>
+              <w:t>Report drafting is done, all 10 sections, the AI tool use declaration, and a revision incorporating a same-day clean evaluation run. Video recording, final PDF export, and zip packaging have not started; deferred until the report review is finished.</w:t>
             </w:r>
           </w:p>
         </w:tc>
@@ -1173,7 +1173,7 @@
           </w:tcPr>
           <w:p>
             <w:r>
-              <w:t>5.1</w:t>
+              <w:t>8.0</w:t>
             </w:r>
           </w:p>
         </w:tc>
@@ -2632,13 +2632,8 @@
             </w:tcBorders>
           </w:tcPr>
           <w:p>
-            <w:pPr>
-              <w:spacing w:before="50" w:after="50"/>
-            </w:pPr>
-            <w:r>
-              <w:rPr>
-                <w:sz w:val="15"/>
-              </w:rPr>
+            <w:r>
+              <w:t>2026-09-17</w:t>
             </w:r>
           </w:p>
         </w:tc>
@@ -2653,13 +2648,8 @@
             </w:tcBorders>
           </w:tcPr>
           <w:p>
-            <w:pPr>
-              <w:spacing w:before="50" w:after="50"/>
-            </w:pPr>
-            <w:r>
-              <w:rPr>
-                <w:sz w:val="15"/>
-              </w:rPr>
+            <w:r>
+              <w:t>Wrote sections 3 through 10 of the capstone report (discovery, requirements, architecture, implementation, evaluation, governance, requirements revision, conclusions) and the AI tool use declaration, grounded in the real PRD, architecture and governance docs, both live evaluation runs, the Stage 5 revision log, and the stakeholder interview notes.</w:t>
             </w:r>
           </w:p>
         </w:tc>
@@ -2674,13 +2664,8 @@
             </w:tcBorders>
           </w:tcPr>
           <w:p>
-            <w:pPr>
-              <w:spacing w:before="50" w:after="50"/>
-            </w:pPr>
-            <w:r>
-              <w:rPr>
-                <w:sz w:val="15"/>
-              </w:rPr>
+            <w:r>
+              <w:t>6. Report, video, packaging</w:t>
             </w:r>
           </w:p>
         </w:tc>
@@ -2695,13 +2680,8 @@
             </w:tcBorders>
           </w:tcPr>
           <w:p>
-            <w:pPr>
-              <w:spacing w:before="50" w:after="50"/>
-            </w:pPr>
-            <w:r>
-              <w:rPr>
-                <w:sz w:val="15"/>
-              </w:rPr>
+            <w:r>
+              <w:t>1.5</w:t>
             </w:r>
           </w:p>
         </w:tc>
@@ -2716,13 +2696,8 @@
             </w:tcBorders>
           </w:tcPr>
           <w:p>
-            <w:pPr>
-              <w:spacing w:before="50" w:after="50"/>
-            </w:pPr>
-            <w:r>
-              <w:rPr>
-                <w:sz w:val="15"/>
-              </w:rPr>
+            <w:r>
+              <w:t>DhanushVaranasi_Capstone_Report.docx (22 pages), verified section by section via PDF render.</w:t>
             </w:r>
           </w:p>
         </w:tc>
@@ -2737,13 +2712,8 @@
             </w:tcBorders>
           </w:tcPr>
           <w:p>
-            <w:pPr>
-              <w:spacing w:before="50" w:after="50"/>
-            </w:pPr>
-            <w:r>
-              <w:rPr>
-                <w:sz w:val="15"/>
-              </w:rPr>
+            <w:r>
+              <w:t>None</w:t>
             </w:r>
           </w:p>
         </w:tc>
@@ -2761,13 +2731,8 @@
             <w:shd w:val="clear" w:fill="F4F4F7"/>
           </w:tcPr>
           <w:p>
-            <w:pPr>
-              <w:spacing w:before="50" w:after="50"/>
-            </w:pPr>
-            <w:r>
-              <w:rPr>
-                <w:sz w:val="15"/>
-              </w:rPr>
+            <w:r>
+              <w:t>2026-09-17</w:t>
             </w:r>
           </w:p>
         </w:tc>
@@ -2783,13 +2748,8 @@
             <w:shd w:val="clear" w:fill="F4F4F7"/>
           </w:tcPr>
           <w:p>
-            <w:pPr>
-              <w:spacing w:before="50" w:after="50"/>
-            </w:pPr>
-            <w:r>
-              <w:rPr>
-                <w:sz w:val="15"/>
-              </w:rPr>
+            <w:r>
+              <w:t>Audited the repository against the submission guide: commit history, credential scan, CI workflow, and whether all five stage workbooks and the effort log were genuinely complete. Caught and corrected a mistaken claim that Stage 1 and Stage 2 were blank, made from checking the wrong folder; the real committed workbooks were already filled.</w:t>
             </w:r>
           </w:p>
         </w:tc>
@@ -2805,13 +2765,8 @@
             <w:shd w:val="clear" w:fill="F4F4F7"/>
           </w:tcPr>
           <w:p>
-            <w:pPr>
-              <w:spacing w:before="50" w:after="50"/>
-            </w:pPr>
-            <w:r>
-              <w:rPr>
-                <w:sz w:val="15"/>
-              </w:rPr>
+            <w:r>
+              <w:t>5. Build and revision</w:t>
             </w:r>
           </w:p>
         </w:tc>
@@ -2827,13 +2782,8 @@
             <w:shd w:val="clear" w:fill="F4F4F7"/>
           </w:tcPr>
           <w:p>
-            <w:pPr>
-              <w:spacing w:before="50" w:after="50"/>
-            </w:pPr>
-            <w:r>
-              <w:rPr>
-                <w:sz w:val="15"/>
-              </w:rPr>
+            <w:r>
+              <w:t>0.4</w:t>
             </w:r>
           </w:p>
         </w:tc>
@@ -2849,13 +2799,8 @@
             <w:shd w:val="clear" w:fill="F4F4F7"/>
           </w:tcPr>
           <w:p>
-            <w:pPr>
-              <w:spacing w:before="50" w:after="50"/>
-            </w:pPr>
-            <w:r>
-              <w:rPr>
-                <w:sz w:val="15"/>
-              </w:rPr>
+            <w:r>
+              <w:t>Submission-checklist findings; two mistakenly generated duplicate workbook files identified and disregarded.</w:t>
             </w:r>
           </w:p>
         </w:tc>
@@ -2871,13 +2816,8 @@
             <w:shd w:val="clear" w:fill="F4F4F7"/>
           </w:tcPr>
           <w:p>
-            <w:pPr>
-              <w:spacing w:before="50" w:after="50"/>
-            </w:pPr>
-            <w:r>
-              <w:rPr>
-                <w:sz w:val="15"/>
-              </w:rPr>
+            <w:r>
+              <w:t>None</w:t>
             </w:r>
           </w:p>
         </w:tc>
@@ -2894,13 +2834,8 @@
             </w:tcBorders>
           </w:tcPr>
           <w:p>
-            <w:pPr>
-              <w:spacing w:before="50" w:after="50"/>
-            </w:pPr>
-            <w:r>
-              <w:rPr>
-                <w:sz w:val="15"/>
-              </w:rPr>
+            <w:r>
+              <w:t>2026-09-17</w:t>
             </w:r>
           </w:p>
         </w:tc>
@@ -2915,13 +2850,8 @@
             </w:tcBorders>
           </w:tcPr>
           <w:p>
-            <w:pPr>
-              <w:spacing w:before="50" w:after="50"/>
-            </w:pPr>
-            <w:r>
-              <w:rPr>
-                <w:sz w:val="15"/>
-              </w:rPr>
+            <w:r>
+              <w:t>Wrote docs/PRD_REVISION_LOG.md so the two existing references to it, in docs/PRD.md and README.md, resolve to real content, rendered from the already-completed Stage 5 workbook rather than new analysis.</w:t>
             </w:r>
           </w:p>
         </w:tc>
@@ -2936,13 +2866,8 @@
             </w:tcBorders>
           </w:tcPr>
           <w:p>
-            <w:pPr>
-              <w:spacing w:before="50" w:after="50"/>
-            </w:pPr>
-            <w:r>
-              <w:rPr>
-                <w:sz w:val="15"/>
-              </w:rPr>
+            <w:r>
+              <w:t>5. Build and revision</w:t>
             </w:r>
           </w:p>
         </w:tc>
@@ -2957,13 +2882,8 @@
             </w:tcBorders>
           </w:tcPr>
           <w:p>
-            <w:pPr>
-              <w:spacing w:before="50" w:after="50"/>
-            </w:pPr>
-            <w:r>
-              <w:rPr>
-                <w:sz w:val="15"/>
-              </w:rPr>
+            <w:r>
+              <w:t>0.2</w:t>
             </w:r>
           </w:p>
         </w:tc>
@@ -2978,13 +2898,8 @@
             </w:tcBorders>
           </w:tcPr>
           <w:p>
-            <w:pPr>
-              <w:spacing w:before="50" w:after="50"/>
-            </w:pPr>
-            <w:r>
-              <w:rPr>
-                <w:sz w:val="15"/>
-              </w:rPr>
+            <w:r>
+              <w:t>docs/PRD_REVISION_LOG.md</w:t>
             </w:r>
           </w:p>
         </w:tc>
@@ -2999,13 +2914,70 @@
             </w:tcBorders>
           </w:tcPr>
           <w:p>
-            <w:pPr>
-              <w:spacing w:before="50" w:after="50"/>
-            </w:pPr>
-            <w:r>
-              <w:rPr>
-                <w:sz w:val="15"/>
-              </w:rPr>
+            <w:r>
+              <w:t>None</w:t>
+            </w:r>
+          </w:p>
+        </w:tc>
+      </w:tr>
+      <w:tr>
+        <w:tc>
+          <w:tcPr>
+            <w:tcW w:type="dxa" w:w="1608"/>
+          </w:tcPr>
+          <w:p>
+            <w:r>
+              <w:t>2026-09-17</w:t>
+            </w:r>
+          </w:p>
+        </w:tc>
+        <w:tc>
+          <w:tcPr>
+            <w:tcW w:type="dxa" w:w="1608"/>
+          </w:tcPr>
+          <w:p>
+            <w:r>
+              <w:t>Incorporated a third, clean evaluation run (a same-day rerun of the 80-ticket validation set with zero fallbacks) into the report and the PRD revision log: rewrote report section 7 and updated sections 1, 8, 9 and 10, corrected the NFR-01 latency root-cause claim (generation-call inference time, not retry backoff, per a final-action latency split), and added a dated addendum to docs/PRD_REVISION_LOG.md recording the clean run's findings, including a newly surfaced customer-tier fairness question the earlier 500-ticket run had appeared to settle.</w:t>
+            </w:r>
+          </w:p>
+        </w:tc>
+        <w:tc>
+          <w:tcPr>
+            <w:tcW w:type="dxa" w:w="1608"/>
+          </w:tcPr>
+          <w:p>
+            <w:r>
+              <w:t>6. Report, video, packaging</w:t>
+            </w:r>
+          </w:p>
+        </w:tc>
+        <w:tc>
+          <w:tcPr>
+            <w:tcW w:type="dxa" w:w="1608"/>
+          </w:tcPr>
+          <w:p>
+            <w:r>
+              <w:t>0.8</w:t>
+            </w:r>
+          </w:p>
+        </w:tc>
+        <w:tc>
+          <w:tcPr>
+            <w:tcW w:type="dxa" w:w="1608"/>
+          </w:tcPr>
+          <w:p>
+            <w:r>
+              <w:t>DhanushVaranasi_Capstone_Report.docx (24 pages), docs/PRD_REVISION_LOG.md addendum.</w:t>
+            </w:r>
+          </w:p>
+        </w:tc>
+        <w:tc>
+          <w:tcPr>
+            <w:tcW w:type="dxa" w:w="1608"/>
+          </w:tcPr>
+          <w:p>
+            <w:r>
+              <w:t>None</w:t>
             </w:r>
           </w:p>
         </w:tc>
@@ -8823,7 +8795,7 @@
           </w:tcPr>
           <w:p>
             <w:r>
-              <w:t>2026-09-16</w:t>
+              <w:t>2026-09-17</w:t>
             </w:r>
           </w:p>
         </w:tc>
@@ -8839,7 +8811,7 @@
           </w:tcPr>
           <w:p>
             <w:r>
-              <w:t>5.1 (today's session only; add any earlier unlogged prep hours here and above if applicable)</w:t>
+              <w:t>8.0 (through 2026-09-17; add any earlier unlogged prep hours here and above if applicable)</w:t>
             </w:r>
           </w:p>
         </w:tc>

</xml_diff>

<commit_message>
Log the LangChain/LangGraph migration hours in the effort log and add a PRD revision log addendum explaining it required no requirements change
</commit_message>
<xml_diff>
--- a/docs/workbooks/Effort_Log.docx
+++ b/docs/workbooks/Effort_Log.docx
@@ -1006,7 +1006,7 @@
           </w:tcPr>
           <w:p>
             <w:r>
-              <w:t>4.4</w:t>
+              <w:t>9.8</w:t>
             </w:r>
           </w:p>
         </w:tc>
@@ -1038,7 +1038,7 @@
           </w:tcPr>
           <w:p>
             <w:r>
-              <w:t>See note in Planned hours. This stage covers the core pipeline build, governance doc, both dependency fixes, the Groq model deprecation fix, both evaluation runs, the decision log bug fix, the PRD revision log workbook, the submission-checklist audit, and creating docs/PRD_REVISION_LOG.md.</w:t>
+              <w:t>See note in Planned hours. This stage covers the core pipeline build, governance doc, both dependency fixes, the Groq model deprecation fix, both evaluation runs, the decision log bug fix, the PRD revision log workbook, the submission-checklist audit, and creating docs/PRD_REVISION_LOG.md. Also covers the LangChain/LangGraph migration to a new branch (StateGraph pipeline, LangChain-wrapped LLM and retrieval clients), the pipeline.py comment pass, the browser demo UI, the architecture-map artifact, and aligning docs/architecture.md, docs/PRD.md, README.md and the dependency files to the migration branch and LangSmith.</w:t>
             </w:r>
           </w:p>
         </w:tc>
@@ -1091,7 +1091,7 @@
           </w:tcPr>
           <w:p>
             <w:r>
-              <w:t>2.3</w:t>
+              <w:t>3.1</w:t>
             </w:r>
           </w:p>
         </w:tc>
@@ -1125,7 +1125,7 @@
           </w:tcPr>
           <w:p>
             <w:r>
-              <w:t>Report drafting is done, all 10 sections, the AI tool use declaration, and a revision incorporating a same-day clean evaluation run. Video recording, final PDF export, and zip packaging have not started; deferred until the report review is finished.</w:t>
+              <w:t>Report drafting is done, all 10 sections, the AI tool use declaration, and a revision incorporating a same-day clean evaluation run. Video recording, final PDF export, and zip packaging have not started; deferred until the report review is finished. Also covers verifying the architecture diagram's metrics, a routing-claim correction, and adding the LangChain/LangGraph/LangSmith section and Figures 2 through 4 to the report.</w:t>
             </w:r>
           </w:p>
         </w:tc>
@@ -1173,7 +1173,7 @@
           </w:tcPr>
           <w:p>
             <w:r>
-              <w:t>8.0</w:t>
+              <w:t>14.2</w:t>
             </w:r>
           </w:p>
         </w:tc>
@@ -2968,6 +2968,254 @@
           <w:p>
             <w:r>
               <w:t>DhanushVaranasi_Capstone_Report.docx (24 pages), docs/PRD_REVISION_LOG.md addendum.</w:t>
+            </w:r>
+          </w:p>
+        </w:tc>
+        <w:tc>
+          <w:tcPr>
+            <w:tcW w:type="dxa" w:w="1608"/>
+          </w:tcPr>
+          <w:p>
+            <w:r>
+              <w:t>None</w:t>
+            </w:r>
+          </w:p>
+        </w:tc>
+      </w:tr>
+      <w:tr>
+        <w:tc>
+          <w:tcPr>
+            <w:tcW w:type="dxa" w:w="1608"/>
+          </w:tcPr>
+          <w:p>
+            <w:r>
+              <w:t>2026-09-17</w:t>
+            </w:r>
+          </w:p>
+        </w:tc>
+        <w:tc>
+          <w:tcPr>
+            <w:tcW w:type="dxa" w:w="1608"/>
+          </w:tcPr>
+          <w:p>
+            <w:r>
+              <w:t>Migrated the pipeline to LangChain and LangGraph on a new branch (langchain-langgraph-migration), left master untouched: rewrote src/pipeline.py as a langgraph.graph.StateGraph (one node per stage, same conditional edges), swapped src/llm_client.py to call Groq through langchain_groq.ChatGroq and src/retrieve/retriever.py to langchain_chroma.Chroma with langchain_huggingface.HuggingFaceEmbeddings, all behind unchanged public interfaces. Fixed a numpy dependency pin needed for Python 3.13.</w:t>
+            </w:r>
+          </w:p>
+        </w:tc>
+        <w:tc>
+          <w:tcPr>
+            <w:tcW w:type="dxa" w:w="1608"/>
+          </w:tcPr>
+          <w:p>
+            <w:r>
+              <w:t>5. Build and revision</w:t>
+            </w:r>
+          </w:p>
+        </w:tc>
+        <w:tc>
+          <w:tcPr>
+            <w:tcW w:type="dxa" w:w="1608"/>
+          </w:tcPr>
+          <w:p>
+            <w:r>
+              <w:t>2.2</w:t>
+            </w:r>
+          </w:p>
+        </w:tc>
+        <w:tc>
+          <w:tcPr>
+            <w:tcW w:type="dxa" w:w="1608"/>
+          </w:tcPr>
+          <w:p>
+            <w:r>
+              <w:t>New branch langchain-langgraph-migration; 53 of 53 tests passing unchanged; two live scenarios run for real against live Groq and live retrieval, one independently confirmed on your own Mac.</w:t>
+            </w:r>
+          </w:p>
+        </w:tc>
+        <w:tc>
+          <w:tcPr>
+            <w:tcW w:type="dxa" w:w="1608"/>
+          </w:tcPr>
+          <w:p>
+            <w:r>
+              <w:t>A numpy resolver failure on Python 3.13, fixed and reverified on 3.11 and 3.13.</w:t>
+            </w:r>
+          </w:p>
+        </w:tc>
+      </w:tr>
+      <w:tr>
+        <w:tc>
+          <w:tcPr>
+            <w:tcW w:type="dxa" w:w="1608"/>
+          </w:tcPr>
+          <w:p>
+            <w:r>
+              <w:t>2026-09-17</w:t>
+            </w:r>
+          </w:p>
+        </w:tc>
+        <w:tc>
+          <w:tcPr>
+            <w:tcW w:type="dxa" w:w="1608"/>
+          </w:tcPr>
+          <w:p>
+            <w:r>
+              <w:t>Added full explanatory comments to src/pipeline.py (state shape, every node, every conditional edge, the graph build) and built a browser demo UI, a chat-style page plus tabs showing each pipeline decision, on both branches for the video.</w:t>
+            </w:r>
+          </w:p>
+        </w:tc>
+        <w:tc>
+          <w:tcPr>
+            <w:tcW w:type="dxa" w:w="1608"/>
+          </w:tcPr>
+          <w:p>
+            <w:r>
+              <w:t>5. Build and revision</w:t>
+            </w:r>
+          </w:p>
+        </w:tc>
+        <w:tc>
+          <w:tcPr>
+            <w:tcW w:type="dxa" w:w="1608"/>
+          </w:tcPr>
+          <w:p>
+            <w:r>
+              <w:t>1.2</w:t>
+            </w:r>
+          </w:p>
+        </w:tc>
+        <w:tc>
+          <w:tcPr>
+            <w:tcW w:type="dxa" w:w="1608"/>
+          </w:tcPr>
+          <w:p>
+            <w:r>
+              <w:t>Commented src/pipeline.py; web/index.html and one new FastAPI route, verified with a fake-client test client and then run live.</w:t>
+            </w:r>
+          </w:p>
+        </w:tc>
+        <w:tc>
+          <w:tcPr>
+            <w:tcW w:type="dxa" w:w="1608"/>
+          </w:tcPr>
+          <w:p>
+            <w:r>
+              <w:t>None</w:t>
+            </w:r>
+          </w:p>
+        </w:tc>
+      </w:tr>
+      <w:tr>
+        <w:tc>
+          <w:tcPr>
+            <w:tcW w:type="dxa" w:w="1608"/>
+          </w:tcPr>
+          <w:p>
+            <w:r>
+              <w:t>2026-09-17</w:t>
+            </w:r>
+          </w:p>
+        </w:tc>
+        <w:tc>
+          <w:tcPr>
+            <w:tcW w:type="dxa" w:w="1608"/>
+          </w:tcPr>
+          <w:p>
+            <w:r>
+              <w:t>Built and published an architecture-map artifact (pipeline flow, routing cascade, and three-layer stack diagrams, a component table, and a LangSmith explanation), then aligned docs/architecture.md, docs/PRD.md, README.md, requirements.txt and .env.example to the migration branch and documented LangSmith tracing. Replaced an initial Mermaid-diagram pass in docs/architecture.md with three custom SVGs matching the artifact's style after review.</w:t>
+            </w:r>
+          </w:p>
+        </w:tc>
+        <w:tc>
+          <w:tcPr>
+            <w:tcW w:type="dxa" w:w="1608"/>
+          </w:tcPr>
+          <w:p>
+            <w:r>
+              <w:t>5. Build and revision</w:t>
+            </w:r>
+          </w:p>
+        </w:tc>
+        <w:tc>
+          <w:tcPr>
+            <w:tcW w:type="dxa" w:w="1608"/>
+          </w:tcPr>
+          <w:p>
+            <w:r>
+              <w:t>2.0</w:t>
+            </w:r>
+          </w:p>
+        </w:tc>
+        <w:tc>
+          <w:tcPr>
+            <w:tcW w:type="dxa" w:w="1608"/>
+          </w:tcPr>
+          <w:p>
+            <w:r>
+              <w:t>Architecture-map artifact; updated docs/architecture.md, docs/PRD.md, README.md, requirements.txt, .env.example; docs/diagrams/pipeline_flow.svg, routing_cascade.svg, layered_stack.svg.</w:t>
+            </w:r>
+          </w:p>
+        </w:tc>
+        <w:tc>
+          <w:tcPr>
+            <w:tcW w:type="dxa" w:w="1608"/>
+          </w:tcPr>
+          <w:p>
+            <w:r>
+              <w:t>First diagram pass used generic Mermaid styling; redone as custom SVGs after review.</w:t>
+            </w:r>
+          </w:p>
+        </w:tc>
+      </w:tr>
+      <w:tr>
+        <w:tc>
+          <w:tcPr>
+            <w:tcW w:type="dxa" w:w="1608"/>
+          </w:tcPr>
+          <w:p>
+            <w:r>
+              <w:t>2026-09-17</w:t>
+            </w:r>
+          </w:p>
+        </w:tc>
+        <w:tc>
+          <w:tcPr>
+            <w:tcW w:type="dxa" w:w="1608"/>
+          </w:tcPr>
+          <w:p>
+            <w:r>
+              <w:t>Verified the architecture diagram's embedded metrics against the code, corrected a report claim about the always-escalate routing rule and billing, and added a LangChain/LangGraph branch subsection, Figures 2 through 4, and a LangSmith paragraph to the capstone report.</w:t>
+            </w:r>
+          </w:p>
+        </w:tc>
+        <w:tc>
+          <w:tcPr>
+            <w:tcW w:type="dxa" w:w="1608"/>
+          </w:tcPr>
+          <w:p>
+            <w:r>
+              <w:t>6. Report, video, packaging</w:t>
+            </w:r>
+          </w:p>
+        </w:tc>
+        <w:tc>
+          <w:tcPr>
+            <w:tcW w:type="dxa" w:w="1608"/>
+          </w:tcPr>
+          <w:p>
+            <w:r>
+              <w:t>0.8</w:t>
+            </w:r>
+          </w:p>
+        </w:tc>
+        <w:tc>
+          <w:tcPr>
+            <w:tcW w:type="dxa" w:w="1608"/>
+          </w:tcPr>
+          <w:p>
+            <w:r>
+              <w:t>DhanushVaranasi_Capstone_Report.docx (27 pages), corrected section 5 routing paragraph.</w:t>
             </w:r>
           </w:p>
         </w:tc>
@@ -8811,7 +9059,7 @@
           </w:tcPr>
           <w:p>
             <w:r>
-              <w:t>8.0 (through 2026-09-17; add any earlier unlogged prep hours here and above if applicable)</w:t>
+              <w:t>14.2 (through 2026-09-17; add any earlier unlogged prep hours here and above if applicable)</w:t>
             </w:r>
           </w:p>
         </w:tc>

</xml_diff>

<commit_message>
Rewrite second person asides in the effort log so it reads as my own submission record, not notes addressed to me
</commit_message>
<xml_diff>
--- a/docs/workbooks/Effort_Log.docx
+++ b/docs/workbooks/Effort_Log.docx
@@ -365,7 +365,7 @@
           </w:tcPr>
           <w:p>
             <w:r>
-              <w:t>2026-09-16 for repository work (all commits and this session's tool history start ~13:15 UTC that day). You mentioned some earlier reading or thinking about the capstone pack on a prior day. ADD THAT DATE HERE if you want it reflected, since there is no artifact evidence of it to derive a date or hour count from.</w:t>
+              <w:t>2026-09-16 for repository work (all commits and tool history start around 13:15 UTC that day).</w:t>
             </w:r>
           </w:p>
         </w:tc>
@@ -2245,7 +2245,7 @@
           </w:tcPr>
           <w:p>
             <w:r>
-              <w:t>Ran the evaluation harness live, in your own terminal, against the 80 ticket validation set.</w:t>
+              <w:t>Ran the evaluation harness live, in my own terminal, against the 80 ticket validation set.</w:t>
             </w:r>
           </w:p>
         </w:tc>
@@ -3029,7 +3029,7 @@
           </w:tcPr>
           <w:p>
             <w:r>
-              <w:t>New branch langchain-langgraph-migration; 53 of 53 tests passing unchanged; two live scenarios run for real against live Groq and live retrieval, one independently confirmed on your own Mac.</w:t>
+              <w:t>New branch langchain-langgraph-migration; 53 of 53 tests passing unchanged; two live scenarios run for real against live Groq and live retrieval, one independently confirmed on my own Mac.</w:t>
             </w:r>
           </w:p>
         </w:tc>
@@ -9027,7 +9027,7 @@
           </w:tcPr>
           <w:p>
             <w:r>
-              <w:t>[SIGN HERE: this assistant cannot sign on your behalf]</w:t>
+              <w:t>[Pending signature]</w:t>
             </w:r>
           </w:p>
         </w:tc>
@@ -9059,7 +9059,7 @@
           </w:tcPr>
           <w:p>
             <w:r>
-              <w:t>14.2 (through 2026-09-17; add any earlier unlogged prep hours here and above if applicable)</w:t>
+              <w:t>14.2 (through 2026-09-17)</w:t>
             </w:r>
           </w:p>
         </w:tc>

</xml_diff>

<commit_message>
README rewrite and workbook review pass
Manual review pass, not autogenerated: restructures README.md around
the actual findings (problem framing, stakeholder-vs-data check, the
reopened fairness finding, the headline provider-outage story, and the
two-branches explanation for this migration), and brings the five
Stage workbooks up to date with the same review.
</commit_message>
<xml_diff>
--- a/docs/workbooks/Effort_Log.docx
+++ b/docs/workbooks/Effort_Log.docx
@@ -495,19 +495,17 @@
           </w:tcPr>
           <w:p>
             <w:r>
-              <w:t>Under 1</w:t>
+              <w:t xml:space="preserve">Under </w:t>
             </w:r>
             <w:r>
               <w:rPr>
                 <w:rFonts w:hint="default"/>
                 <w:lang w:val="en-US"/>
               </w:rPr>
-              <w:t>5</w:t>
-            </w:r>
-            <w:bookmarkStart w:id="0" w:name="_GoBack"/>
-            <w:bookmarkEnd w:id="0"/>
-            <w:r>
-              <w:t xml:space="preserve"> hours per week</w:t>
+              <w:t xml:space="preserve">25 </w:t>
+            </w:r>
+            <w:r>
+              <w:t>hours per week</w:t>
             </w:r>
           </w:p>
         </w:tc>
@@ -735,8 +733,18 @@
             </w:tcBorders>
           </w:tcPr>
           <w:p>
-            <w:r>
-              <w:t>No separate estimate (Stage 4 Sprint Plan, Section 1).</w:t>
+            <w:pPr>
+              <w:rPr>
+                <w:rFonts w:hint="default"/>
+                <w:lang w:val="en-US"/>
+              </w:rPr>
+            </w:pPr>
+            <w:r>
+              <w:rPr>
+                <w:rFonts w:hint="default"/>
+                <w:lang w:val="en-US"/>
+              </w:rPr>
+              <w:t>18</w:t>
             </w:r>
           </w:p>
         </w:tc>
@@ -751,8 +759,18 @@
             </w:tcBorders>
           </w:tcPr>
           <w:p>
-            <w:r>
-              <w:t>5.8</w:t>
+            <w:pPr>
+              <w:rPr>
+                <w:rFonts w:hint="default"/>
+                <w:lang w:val="en-US"/>
+              </w:rPr>
+            </w:pPr>
+            <w:r>
+              <w:rPr>
+                <w:rFonts w:hint="default"/>
+                <w:lang w:val="en-US"/>
+              </w:rPr>
+              <w:t>6</w:t>
             </w:r>
           </w:p>
         </w:tc>
@@ -767,8 +785,18 @@
             </w:tcBorders>
           </w:tcPr>
           <w:p>
-            <w:r>
-              <w:t>N/A</w:t>
+            <w:pPr>
+              <w:rPr>
+                <w:rFonts w:hint="default"/>
+                <w:lang w:val="en-US"/>
+              </w:rPr>
+            </w:pPr>
+            <w:r>
+              <w:rPr>
+                <w:rFonts w:hint="default"/>
+                <w:lang w:val="en-US"/>
+              </w:rPr>
+              <w:t>-12</w:t>
             </w:r>
           </w:p>
         </w:tc>
@@ -783,8 +811,18 @@
             </w:tcBorders>
           </w:tcPr>
           <w:p>
-            <w:r>
-              <w:t>See note in Planned hours.</w:t>
+            <w:pPr>
+              <w:rPr>
+                <w:rFonts w:hint="default"/>
+                <w:lang w:val="en-US"/>
+              </w:rPr>
+            </w:pPr>
+            <w:r>
+              <w:rPr>
+                <w:rFonts w:hint="default"/>
+                <w:lang w:val="en-US"/>
+              </w:rPr>
+              <w:t>AI assisted as well as cross checking</w:t>
             </w:r>
           </w:p>
         </w:tc>
@@ -823,7 +861,11 @@
           </w:tcPr>
           <w:p>
             <w:r>
-              <w:t>No separate estimate (Stage 4 Sprint Plan, Section 1).</w:t>
+              <w:rPr>
+                <w:rFonts w:hint="default"/>
+                <w:lang w:val="en-US"/>
+              </w:rPr>
+              <w:t>15</w:t>
             </w:r>
           </w:p>
         </w:tc>
@@ -839,8 +881,18 @@
             <w:shd w:val="clear" w:color="auto" w:fill="F4F4F7"/>
           </w:tcPr>
           <w:p>
-            <w:r>
-              <w:t>0.4</w:t>
+            <w:pPr>
+              <w:rPr>
+                <w:rFonts w:hint="default"/>
+                <w:lang w:val="en-US"/>
+              </w:rPr>
+            </w:pPr>
+            <w:r>
+              <w:rPr>
+                <w:rFonts w:hint="default"/>
+                <w:lang w:val="en-US"/>
+              </w:rPr>
+              <w:t>10</w:t>
             </w:r>
           </w:p>
         </w:tc>
@@ -857,7 +909,7 @@
           </w:tcPr>
           <w:p>
             <w:r>
-              <w:t>N/A</w:t>
+              <w:t>-5</w:t>
             </w:r>
           </w:p>
         </w:tc>
@@ -874,7 +926,7 @@
           </w:tcPr>
           <w:p>
             <w:r>
-              <w:t>See note in Planned hours.</w:t>
+              <w:t>Extra time spent cross-checking the stakeholder transcripts against the draft requirements list.</w:t>
             </w:r>
           </w:p>
         </w:tc>
@@ -911,7 +963,7 @@
           </w:tcPr>
           <w:p>
             <w:r>
-              <w:t>No separate estimate (Stage 4 Sprint Plan, Section 1).</w:t>
+              <w:t>2</w:t>
             </w:r>
           </w:p>
         </w:tc>
@@ -943,7 +995,7 @@
           </w:tcPr>
           <w:p>
             <w:r>
-              <w:t>N/A</w:t>
+              <w:t>1</w:t>
             </w:r>
           </w:p>
         </w:tc>
@@ -959,7 +1011,7 @@
           </w:tcPr>
           <w:p>
             <w:r>
-              <w:t>See note in Planned hours.</w:t>
+              <w:t>Iterated on prompts more than planned to reduce hallucination risk.</w:t>
             </w:r>
           </w:p>
         </w:tc>
@@ -1134,7 +1186,7 @@
           </w:tcPr>
           <w:p>
             <w:r>
-              <w:t>AI-assisted build; see Table 6 for the item-level estimate comparison.</w:t>
+              <w:t>AI-assisted, single integrated build session rather than the sequential per-item plan.</w:t>
             </w:r>
           </w:p>
         </w:tc>
@@ -1173,7 +1225,7 @@
           </w:tcPr>
           <w:p>
             <w:r>
-              <w:t>24</w:t>
+              <w:t>28</w:t>
             </w:r>
           </w:p>
         </w:tc>
@@ -1207,7 +1259,7 @@
           </w:tcPr>
           <w:p>
             <w:r>
-              <w:t>-20.9</w:t>
+              <w:t>-24.9</w:t>
             </w:r>
           </w:p>
         </w:tc>
@@ -1224,7 +1276,7 @@
           </w:tcPr>
           <w:p>
             <w:r>
-              <w:t>Report only; video and packaging not started yet.</w:t>
+              <w:t>Report drafted; video and packaging still in progress toward the estimate.</w:t>
             </w:r>
           </w:p>
         </w:tc>
@@ -1273,7 +1325,7 @@
           </w:tcPr>
           <w:p>
             <w:r>
-              <w:t>19.7</w:t>
+              <w:t>32.2</w:t>
             </w:r>
           </w:p>
         </w:tc>
@@ -1514,9 +1566,12 @@
         </w:tc>
       </w:tr>
       <w:tr>
-        <w:tc>
-          <w:tcPr>
-            <w:tcW w:type="dxa" w:w="1608"/>
+        <w:trPr>
+          <w:jc w:val="center"/>
+        </w:trPr>
+        <w:tc>
+          <w:tcPr>
+            <w:tcW w:w="1608" w:type="dxa"/>
           </w:tcPr>
           <w:p>
             <w:r>
@@ -1526,7 +1581,7 @@
         </w:tc>
         <w:tc>
           <w:tcPr>
-            <w:tcW w:type="dxa" w:w="1608"/>
+            <w:tcW w:w="1608" w:type="dxa"/>
           </w:tcPr>
           <w:p>
             <w:r>
@@ -1536,7 +1591,7 @@
         </w:tc>
         <w:tc>
           <w:tcPr>
-            <w:tcW w:type="dxa" w:w="1608"/>
+            <w:tcW w:w="1608" w:type="dxa"/>
           </w:tcPr>
           <w:p>
             <w:r>
@@ -1546,7 +1601,7 @@
         </w:tc>
         <w:tc>
           <w:tcPr>
-            <w:tcW w:type="dxa" w:w="1608"/>
+            <w:tcW w:w="1608" w:type="dxa"/>
           </w:tcPr>
           <w:p>
             <w:r>
@@ -1556,7 +1611,7 @@
         </w:tc>
         <w:tc>
           <w:tcPr>
-            <w:tcW w:type="dxa" w:w="1608"/>
+            <w:tcW w:w="1608" w:type="dxa"/>
           </w:tcPr>
           <w:p>
             <w:r>
@@ -1566,7 +1621,7 @@
         </w:tc>
         <w:tc>
           <w:tcPr>
-            <w:tcW w:type="dxa" w:w="1608"/>
+            <w:tcW w:w="1608" w:type="dxa"/>
           </w:tcPr>
           <w:p>
             <w:r>
@@ -1576,9 +1631,12 @@
         </w:tc>
       </w:tr>
       <w:tr>
-        <w:tc>
-          <w:tcPr>
-            <w:tcW w:type="dxa" w:w="1608"/>
+        <w:trPr>
+          <w:jc w:val="center"/>
+        </w:trPr>
+        <w:tc>
+          <w:tcPr>
+            <w:tcW w:w="1608" w:type="dxa"/>
           </w:tcPr>
           <w:p>
             <w:r>
@@ -1588,7 +1646,7 @@
         </w:tc>
         <w:tc>
           <w:tcPr>
-            <w:tcW w:type="dxa" w:w="1608"/>
+            <w:tcW w:w="1608" w:type="dxa"/>
           </w:tcPr>
           <w:p>
             <w:r>
@@ -1598,7 +1656,7 @@
         </w:tc>
         <w:tc>
           <w:tcPr>
-            <w:tcW w:type="dxa" w:w="1608"/>
+            <w:tcW w:w="1608" w:type="dxa"/>
           </w:tcPr>
           <w:p>
             <w:r>
@@ -1608,7 +1666,7 @@
         </w:tc>
         <w:tc>
           <w:tcPr>
-            <w:tcW w:type="dxa" w:w="1608"/>
+            <w:tcW w:w="1608" w:type="dxa"/>
           </w:tcPr>
           <w:p>
             <w:r>
@@ -1618,7 +1676,7 @@
         </w:tc>
         <w:tc>
           <w:tcPr>
-            <w:tcW w:type="dxa" w:w="1608"/>
+            <w:tcW w:w="1608" w:type="dxa"/>
           </w:tcPr>
           <w:p>
             <w:r>
@@ -1628,7 +1686,7 @@
         </w:tc>
         <w:tc>
           <w:tcPr>
-            <w:tcW w:type="dxa" w:w="1608"/>
+            <w:tcW w:w="1608" w:type="dxa"/>
           </w:tcPr>
           <w:p>
             <w:r>
@@ -1638,9 +1696,12 @@
         </w:tc>
       </w:tr>
       <w:tr>
-        <w:tc>
-          <w:tcPr>
-            <w:tcW w:type="dxa" w:w="1608"/>
+        <w:trPr>
+          <w:jc w:val="center"/>
+        </w:trPr>
+        <w:tc>
+          <w:tcPr>
+            <w:tcW w:w="1608" w:type="dxa"/>
           </w:tcPr>
           <w:p>
             <w:r>
@@ -1650,7 +1711,7 @@
         </w:tc>
         <w:tc>
           <w:tcPr>
-            <w:tcW w:type="dxa" w:w="1608"/>
+            <w:tcW w:w="1608" w:type="dxa"/>
           </w:tcPr>
           <w:p>
             <w:r>
@@ -1660,7 +1721,7 @@
         </w:tc>
         <w:tc>
           <w:tcPr>
-            <w:tcW w:type="dxa" w:w="1608"/>
+            <w:tcW w:w="1608" w:type="dxa"/>
           </w:tcPr>
           <w:p>
             <w:r>
@@ -1670,7 +1731,7 @@
         </w:tc>
         <w:tc>
           <w:tcPr>
-            <w:tcW w:type="dxa" w:w="1608"/>
+            <w:tcW w:w="1608" w:type="dxa"/>
           </w:tcPr>
           <w:p>
             <w:r>
@@ -1680,7 +1741,7 @@
         </w:tc>
         <w:tc>
           <w:tcPr>
-            <w:tcW w:type="dxa" w:w="1608"/>
+            <w:tcW w:w="1608" w:type="dxa"/>
           </w:tcPr>
           <w:p>
             <w:r>
@@ -1690,7 +1751,7 @@
         </w:tc>
         <w:tc>
           <w:tcPr>
-            <w:tcW w:type="dxa" w:w="1608"/>
+            <w:tcW w:w="1608" w:type="dxa"/>
           </w:tcPr>
           <w:p>
             <w:r>
@@ -1700,59 +1761,62 @@
         </w:tc>
       </w:tr>
       <w:tr>
-        <w:tc>
-          <w:tcPr>
-            <w:tcW w:type="dxa" w:w="1608"/>
-          </w:tcPr>
-          <w:p>
-            <w:r>
-              <w:t>2026-09-13</w:t>
-            </w:r>
-          </w:p>
-        </w:tc>
-        <w:tc>
-          <w:tcPr>
-            <w:tcW w:type="dxa" w:w="1608"/>
-          </w:tcPr>
-          <w:p>
-            <w:r>
-              <w:t>Read the governance framework and all five stage workbook templates.</w:t>
-            </w:r>
-          </w:p>
-        </w:tc>
-        <w:tc>
-          <w:tcPr>
-            <w:tcW w:type="dxa" w:w="1608"/>
-          </w:tcPr>
-          <w:p>
-            <w:r>
-              <w:t>1. Discovery</w:t>
-            </w:r>
-          </w:p>
-        </w:tc>
-        <w:tc>
-          <w:tcPr>
-            <w:tcW w:type="dxa" w:w="1608"/>
-          </w:tcPr>
-          <w:p>
-            <w:r>
-              <w:t>1.0</w:t>
-            </w:r>
-          </w:p>
-        </w:tc>
-        <w:tc>
-          <w:tcPr>
-            <w:tcW w:type="dxa" w:w="1608"/>
-          </w:tcPr>
-          <w:p>
-            <w:r>
-              <w:t>Understanding of governance requirements and workbook structure.</w:t>
-            </w:r>
-          </w:p>
-        </w:tc>
-        <w:tc>
-          <w:tcPr>
-            <w:tcW w:type="dxa" w:w="1608"/>
+        <w:trPr>
+          <w:jc w:val="center"/>
+        </w:trPr>
+        <w:tc>
+          <w:tcPr>
+            <w:tcW w:w="1608" w:type="dxa"/>
+          </w:tcPr>
+          <w:p>
+            <w:r>
+              <w:t>2026-09-12</w:t>
+            </w:r>
+          </w:p>
+        </w:tc>
+        <w:tc>
+          <w:tcPr>
+            <w:tcW w:w="1608" w:type="dxa"/>
+          </w:tcPr>
+          <w:p>
+            <w:r>
+              <w:t>Read the dataset guide in detail and mapped ticket categories and fields to draft requirements.</w:t>
+            </w:r>
+          </w:p>
+        </w:tc>
+        <w:tc>
+          <w:tcPr>
+            <w:tcW w:w="1608" w:type="dxa"/>
+          </w:tcPr>
+          <w:p>
+            <w:r>
+              <w:t>2. Requirements</w:t>
+            </w:r>
+          </w:p>
+        </w:tc>
+        <w:tc>
+          <w:tcPr>
+            <w:tcW w:w="1608" w:type="dxa"/>
+          </w:tcPr>
+          <w:p>
+            <w:r>
+              <w:t>3.0</w:t>
+            </w:r>
+          </w:p>
+        </w:tc>
+        <w:tc>
+          <w:tcPr>
+            <w:tcW w:w="1608" w:type="dxa"/>
+          </w:tcPr>
+          <w:p>
+            <w:r>
+              <w:t>Rough mapping of ticket data to candidate requirements.</w:t>
+            </w:r>
+          </w:p>
+        </w:tc>
+        <w:tc>
+          <w:tcPr>
+            <w:tcW w:w="1608" w:type="dxa"/>
           </w:tcPr>
           <w:p>
             <w:r>
@@ -1762,29 +1826,32 @@
         </w:tc>
       </w:tr>
       <w:tr>
-        <w:tc>
-          <w:tcPr>
-            <w:tcW w:type="dxa" w:w="1608"/>
-          </w:tcPr>
-          <w:p>
-            <w:r>
-              <w:t>2026-09-14</w:t>
-            </w:r>
-          </w:p>
-        </w:tc>
-        <w:tc>
-          <w:tcPr>
-            <w:tcW w:type="dxa" w:w="1608"/>
-          </w:tcPr>
-          <w:p>
-            <w:r>
-              <w:t>Re-read the build specification and mapped requirements to acceptance criteria.</w:t>
-            </w:r>
-          </w:p>
-        </w:tc>
-        <w:tc>
-          <w:tcPr>
-            <w:tcW w:type="dxa" w:w="1608"/>
+        <w:trPr>
+          <w:jc w:val="center"/>
+        </w:trPr>
+        <w:tc>
+          <w:tcPr>
+            <w:tcW w:w="1608" w:type="dxa"/>
+          </w:tcPr>
+          <w:p>
+            <w:r>
+              <w:t>2026-09-13</w:t>
+            </w:r>
+          </w:p>
+        </w:tc>
+        <w:tc>
+          <w:tcPr>
+            <w:tcW w:w="1608" w:type="dxa"/>
+          </w:tcPr>
+          <w:p>
+            <w:r>
+              <w:t>Read the governance framework and all five stage workbook templates.</w:t>
+            </w:r>
+          </w:p>
+        </w:tc>
+        <w:tc>
+          <w:tcPr>
+            <w:tcW w:w="1608" w:type="dxa"/>
           </w:tcPr>
           <w:p>
             <w:r>
@@ -1794,27 +1861,27 @@
         </w:tc>
         <w:tc>
           <w:tcPr>
-            <w:tcW w:type="dxa" w:w="1608"/>
-          </w:tcPr>
-          <w:p>
-            <w:r>
-              <w:t>0.5</w:t>
-            </w:r>
-          </w:p>
-        </w:tc>
-        <w:tc>
-          <w:tcPr>
-            <w:tcW w:type="dxa" w:w="1608"/>
-          </w:tcPr>
-          <w:p>
-            <w:r>
-              <w:t>Rough map of system requirements.</w:t>
-            </w:r>
-          </w:p>
-        </w:tc>
-        <w:tc>
-          <w:tcPr>
-            <w:tcW w:type="dxa" w:w="1608"/>
+            <w:tcW w:w="1608" w:type="dxa"/>
+          </w:tcPr>
+          <w:p>
+            <w:r>
+              <w:t>1.0</w:t>
+            </w:r>
+          </w:p>
+        </w:tc>
+        <w:tc>
+          <w:tcPr>
+            <w:tcW w:w="1608" w:type="dxa"/>
+          </w:tcPr>
+          <w:p>
+            <w:r>
+              <w:t>Understanding of governance requirements and workbook structure.</w:t>
+            </w:r>
+          </w:p>
+        </w:tc>
+        <w:tc>
+          <w:tcPr>
+            <w:tcW w:w="1608" w:type="dxa"/>
           </w:tcPr>
           <w:p>
             <w:r>
@@ -1824,9 +1891,272 @@
         </w:tc>
       </w:tr>
       <w:tr>
-        <w:tc>
-          <w:tcPr>
-            <w:tcW w:type="dxa" w:w="1608"/>
+        <w:trPr>
+          <w:jc w:val="center"/>
+        </w:trPr>
+        <w:tc>
+          <w:tcPr>
+            <w:tcW w:w="1608" w:type="dxa"/>
+          </w:tcPr>
+          <w:p>
+            <w:r>
+              <w:t>2026-09-13</w:t>
+            </w:r>
+          </w:p>
+        </w:tc>
+        <w:tc>
+          <w:tcPr>
+            <w:tcW w:w="1608" w:type="dxa"/>
+          </w:tcPr>
+          <w:p>
+            <w:r>
+              <w:t>Read all five stakeholder interview transcripts a second time, extracting explicit and implied requirements from each.</w:t>
+            </w:r>
+          </w:p>
+        </w:tc>
+        <w:tc>
+          <w:tcPr>
+            <w:tcW w:w="1608" w:type="dxa"/>
+          </w:tcPr>
+          <w:p>
+            <w:r>
+              <w:t>2. Requirements</w:t>
+            </w:r>
+          </w:p>
+        </w:tc>
+        <w:tc>
+          <w:tcPr>
+            <w:tcW w:w="1608" w:type="dxa"/>
+          </w:tcPr>
+          <w:p>
+            <w:r>
+              <w:t>4.0</w:t>
+            </w:r>
+          </w:p>
+        </w:tc>
+        <w:tc>
+          <w:tcPr>
+            <w:tcW w:w="1608" w:type="dxa"/>
+          </w:tcPr>
+          <w:p>
+            <w:r>
+              <w:t>Requirements extracted from all five interviews.</w:t>
+            </w:r>
+          </w:p>
+        </w:tc>
+        <w:tc>
+          <w:tcPr>
+            <w:tcW w:w="1608" w:type="dxa"/>
+          </w:tcPr>
+          <w:p>
+            <w:r>
+              <w:t>None</w:t>
+            </w:r>
+          </w:p>
+        </w:tc>
+      </w:tr>
+      <w:tr>
+        <w:trPr>
+          <w:jc w:val="center"/>
+        </w:trPr>
+        <w:tc>
+          <w:tcPr>
+            <w:tcW w:w="1608" w:type="dxa"/>
+          </w:tcPr>
+          <w:p>
+            <w:r>
+              <w:t>2026-09-14</w:t>
+            </w:r>
+          </w:p>
+        </w:tc>
+        <w:tc>
+          <w:tcPr>
+            <w:tcW w:w="1608" w:type="dxa"/>
+          </w:tcPr>
+          <w:p>
+            <w:r>
+              <w:t>Re-read the build specification and mapped requirements to acceptance criteria.</w:t>
+            </w:r>
+          </w:p>
+        </w:tc>
+        <w:tc>
+          <w:tcPr>
+            <w:tcW w:w="1608" w:type="dxa"/>
+          </w:tcPr>
+          <w:p>
+            <w:r>
+              <w:t>1. Discovery</w:t>
+            </w:r>
+          </w:p>
+        </w:tc>
+        <w:tc>
+          <w:tcPr>
+            <w:tcW w:w="1608" w:type="dxa"/>
+          </w:tcPr>
+          <w:p>
+            <w:r>
+              <w:t>0.5</w:t>
+            </w:r>
+          </w:p>
+        </w:tc>
+        <w:tc>
+          <w:tcPr>
+            <w:tcW w:w="1608" w:type="dxa"/>
+          </w:tcPr>
+          <w:p>
+            <w:r>
+              <w:t>Rough map of system requirements.</w:t>
+            </w:r>
+          </w:p>
+        </w:tc>
+        <w:tc>
+          <w:tcPr>
+            <w:tcW w:w="1608" w:type="dxa"/>
+          </w:tcPr>
+          <w:p>
+            <w:r>
+              <w:t>None</w:t>
+            </w:r>
+          </w:p>
+        </w:tc>
+      </w:tr>
+      <w:tr>
+        <w:trPr>
+          <w:jc w:val="center"/>
+        </w:trPr>
+        <w:tc>
+          <w:tcPr>
+            <w:tcW w:w="1608" w:type="dxa"/>
+          </w:tcPr>
+          <w:p>
+            <w:r>
+              <w:t>2026-09-14</w:t>
+            </w:r>
+          </w:p>
+        </w:tc>
+        <w:tc>
+          <w:tcPr>
+            <w:tcW w:w="1608" w:type="dxa"/>
+          </w:tcPr>
+          <w:p>
+            <w:r>
+              <w:t>Drafted a rough requirements list and checked it against the evaluation framework and governance framework.</w:t>
+            </w:r>
+          </w:p>
+        </w:tc>
+        <w:tc>
+          <w:tcPr>
+            <w:tcW w:w="1608" w:type="dxa"/>
+          </w:tcPr>
+          <w:p>
+            <w:r>
+              <w:t>2. Requirements</w:t>
+            </w:r>
+          </w:p>
+        </w:tc>
+        <w:tc>
+          <w:tcPr>
+            <w:tcW w:w="1608" w:type="dxa"/>
+          </w:tcPr>
+          <w:p>
+            <w:r>
+              <w:t>2.0</w:t>
+            </w:r>
+          </w:p>
+        </w:tc>
+        <w:tc>
+          <w:tcPr>
+            <w:tcW w:w="1608" w:type="dxa"/>
+          </w:tcPr>
+          <w:p>
+            <w:r>
+              <w:t>First draft requirements list.</w:t>
+            </w:r>
+          </w:p>
+        </w:tc>
+        <w:tc>
+          <w:tcPr>
+            <w:tcW w:w="1608" w:type="dxa"/>
+          </w:tcPr>
+          <w:p>
+            <w:r>
+              <w:t>None</w:t>
+            </w:r>
+          </w:p>
+        </w:tc>
+      </w:tr>
+      <w:tr>
+        <w:trPr>
+          <w:jc w:val="center"/>
+        </w:trPr>
+        <w:tc>
+          <w:tcPr>
+            <w:tcW w:w="1608" w:type="dxa"/>
+          </w:tcPr>
+          <w:p>
+            <w:r>
+              <w:t>2026-09-14</w:t>
+            </w:r>
+          </w:p>
+        </w:tc>
+        <w:tc>
+          <w:tcPr>
+            <w:tcW w:w="1608" w:type="dxa"/>
+          </w:tcPr>
+          <w:p>
+            <w:r>
+              <w:t>Drafted a first set of candidate prompts for the classifier and generator, based on the build specification's prompt guidance.</w:t>
+            </w:r>
+          </w:p>
+        </w:tc>
+        <w:tc>
+          <w:tcPr>
+            <w:tcW w:w="1608" w:type="dxa"/>
+          </w:tcPr>
+          <w:p>
+            <w:r>
+              <w:t>3. Prompt library</w:t>
+            </w:r>
+          </w:p>
+        </w:tc>
+        <w:tc>
+          <w:tcPr>
+            <w:tcW w:w="1608" w:type="dxa"/>
+          </w:tcPr>
+          <w:p>
+            <w:r>
+              <w:t>1.5</w:t>
+            </w:r>
+          </w:p>
+        </w:tc>
+        <w:tc>
+          <w:tcPr>
+            <w:tcW w:w="1608" w:type="dxa"/>
+          </w:tcPr>
+          <w:p>
+            <w:r>
+              <w:t>Draft prompt set.</w:t>
+            </w:r>
+          </w:p>
+        </w:tc>
+        <w:tc>
+          <w:tcPr>
+            <w:tcW w:w="1608" w:type="dxa"/>
+          </w:tcPr>
+          <w:p>
+            <w:r>
+              <w:t>None</w:t>
+            </w:r>
+          </w:p>
+        </w:tc>
+      </w:tr>
+      <w:tr>
+        <w:trPr>
+          <w:jc w:val="center"/>
+        </w:trPr>
+        <w:tc>
+          <w:tcPr>
+            <w:tcW w:w="1608" w:type="dxa"/>
           </w:tcPr>
           <w:p>
             <w:r>
@@ -1836,7 +2166,7 @@
         </w:tc>
         <w:tc>
           <w:tcPr>
-            <w:tcW w:type="dxa" w:w="1608"/>
+            <w:tcW w:w="1608" w:type="dxa"/>
           </w:tcPr>
           <w:p>
             <w:r>
@@ -1846,7 +2176,7 @@
         </w:tc>
         <w:tc>
           <w:tcPr>
-            <w:tcW w:type="dxa" w:w="1608"/>
+            <w:tcW w:w="1608" w:type="dxa"/>
           </w:tcPr>
           <w:p>
             <w:r>
@@ -1856,17 +2186,17 @@
         </w:tc>
         <w:tc>
           <w:tcPr>
-            <w:tcW w:type="dxa" w:w="1608"/>
-          </w:tcPr>
-          <w:p>
-            <w:r>
-              <w:t>0.5</w:t>
-            </w:r>
-          </w:p>
-        </w:tc>
-        <w:tc>
-          <w:tcPr>
-            <w:tcW w:type="dxa" w:w="1608"/>
+            <w:tcW w:w="1608" w:type="dxa"/>
+          </w:tcPr>
+          <w:p>
+            <w:r>
+              <w:t>0.7</w:t>
+            </w:r>
+          </w:p>
+        </w:tc>
+        <w:tc>
+          <w:tcPr>
+            <w:tcW w:w="1608" w:type="dxa"/>
           </w:tcPr>
           <w:p>
             <w:r>
@@ -1876,7 +2206,137 @@
         </w:tc>
         <w:tc>
           <w:tcPr>
-            <w:tcW w:type="dxa" w:w="1608"/>
+            <w:tcW w:w="1608" w:type="dxa"/>
+          </w:tcPr>
+          <w:p>
+            <w:r>
+              <w:t>None</w:t>
+            </w:r>
+          </w:p>
+        </w:tc>
+      </w:tr>
+      <w:tr>
+        <w:trPr>
+          <w:jc w:val="center"/>
+        </w:trPr>
+        <w:tc>
+          <w:tcPr>
+            <w:tcW w:w="1608" w:type="dxa"/>
+          </w:tcPr>
+          <w:p>
+            <w:r>
+              <w:t>2026-09-15</w:t>
+            </w:r>
+          </w:p>
+        </w:tc>
+        <w:tc>
+          <w:tcPr>
+            <w:tcW w:w="1608" w:type="dxa"/>
+          </w:tcPr>
+          <w:p>
+            <w:r>
+              <w:t>Reviewed the Submission Guide's expectations for the PRD and refined the requirements list.</w:t>
+            </w:r>
+          </w:p>
+        </w:tc>
+        <w:tc>
+          <w:tcPr>
+            <w:tcW w:w="1608" w:type="dxa"/>
+          </w:tcPr>
+          <w:p>
+            <w:r>
+              <w:t>2. Requirements</w:t>
+            </w:r>
+          </w:p>
+        </w:tc>
+        <w:tc>
+          <w:tcPr>
+            <w:tcW w:w="1608" w:type="dxa"/>
+          </w:tcPr>
+          <w:p>
+            <w:r>
+              <w:t>1.0</w:t>
+            </w:r>
+          </w:p>
+        </w:tc>
+        <w:tc>
+          <w:tcPr>
+            <w:tcW w:w="1608" w:type="dxa"/>
+          </w:tcPr>
+          <w:p>
+            <w:r>
+              <w:t>Refined requirements list.</w:t>
+            </w:r>
+          </w:p>
+        </w:tc>
+        <w:tc>
+          <w:tcPr>
+            <w:tcW w:w="1608" w:type="dxa"/>
+          </w:tcPr>
+          <w:p>
+            <w:r>
+              <w:t>None</w:t>
+            </w:r>
+          </w:p>
+        </w:tc>
+      </w:tr>
+      <w:tr>
+        <w:trPr>
+          <w:jc w:val="center"/>
+        </w:trPr>
+        <w:tc>
+          <w:tcPr>
+            <w:tcW w:w="1608" w:type="dxa"/>
+          </w:tcPr>
+          <w:p>
+            <w:r>
+              <w:t>2026-09-15</w:t>
+            </w:r>
+          </w:p>
+        </w:tc>
+        <w:tc>
+          <w:tcPr>
+            <w:tcW w:w="1608" w:type="dxa"/>
+          </w:tcPr>
+          <w:p>
+            <w:r>
+              <w:t>Refined the prompt drafts and noted edge cases to test once the pipeline existed.</w:t>
+            </w:r>
+          </w:p>
+        </w:tc>
+        <w:tc>
+          <w:tcPr>
+            <w:tcW w:w="1608" w:type="dxa"/>
+          </w:tcPr>
+          <w:p>
+            <w:r>
+              <w:t>3. Prompt library</w:t>
+            </w:r>
+          </w:p>
+        </w:tc>
+        <w:tc>
+          <w:tcPr>
+            <w:tcW w:w="1608" w:type="dxa"/>
+          </w:tcPr>
+          <w:p>
+            <w:r>
+              <w:t>1.5</w:t>
+            </w:r>
+          </w:p>
+        </w:tc>
+        <w:tc>
+          <w:tcPr>
+            <w:tcW w:w="1608" w:type="dxa"/>
+          </w:tcPr>
+          <w:p>
+            <w:r>
+              <w:t>Refined prompt set; list of edge cases.</w:t>
+            </w:r>
+          </w:p>
+        </w:tc>
+        <w:tc>
+          <w:tcPr>
+            <w:tcW w:w="1608" w:type="dxa"/>
           </w:tcPr>
           <w:p>
             <w:r>
@@ -8430,7 +8890,14 @@
           </w:tcPr>
           <w:p>
             <w:r>
-              <w:t>Not the code itself but the 500 ticket evaluation run: 42.7 minutes of wall clock time, and partway through it Groq's daily token quota was exhausted, which was not budgeted for at all since the free tier was assumed to simply work for a run of that size.</w:t>
+              <w:rPr>
+                <w:rFonts w:hint="default"/>
+                <w:lang w:val="en-US"/>
+              </w:rPr>
+              <w:t>The Documentation and also n</w:t>
+            </w:r>
+            <w:r>
+              <w:t>ot the code itself but the 500 ticket evaluation run: 42.7 minutes of wall clock time, and partway through it Groq's daily token quota was exhausted, which was not budgeted for at all since the free tier was assumed to simply work for a run of that size.</w:t>
             </w:r>
           </w:p>
         </w:tc>
@@ -8747,9 +9214,21 @@
             </w:tcBorders>
           </w:tcPr>
           <w:p>
-            <w:r>
-              <w:t>[Pending signature]</w:t>
-            </w:r>
+            <w:pPr>
+              <w:rPr>
+                <w:rFonts w:hint="default"/>
+                <w:lang w:val="en-US"/>
+              </w:rPr>
+            </w:pPr>
+            <w:r>
+              <w:rPr>
+                <w:rFonts w:hint="default"/>
+                <w:lang w:val="en-US"/>
+              </w:rPr>
+              <w:t>Dhanush Varanasi</w:t>
+            </w:r>
+            <w:bookmarkStart w:id="0" w:name="_GoBack"/>
+            <w:bookmarkEnd w:id="0"/>
           </w:p>
         </w:tc>
         <w:tc>
@@ -8780,7 +9259,7 @@
           </w:tcPr>
           <w:p>
             <w:r>
-              <w:t>19.7</w:t>
+              <w:t>32.2</w:t>
             </w:r>
           </w:p>
         </w:tc>

</xml_diff>